<commit_message>
Simplify tradeoff report formatting and wording
</commit_message>
<xml_diff>
--- a/analysis/BUSINESS_TECHNICAL_TRADEOFFS.docx
+++ b/analysis/BUSINESS_TECHNICAL_TRADEOFFS.docx
@@ -11,39 +11,8 @@
       </w:r>
     </w:p>
     <w:p>
-      <w:pPr/>
       <w:r>
-        <w:rPr>
-          <w:b/>
-        </w:rPr>
-        <w:t>Scope.</w:t>
-      </w:r>
-      <w:r>
-        <w:t xml:space="preserve"> This paper evaluates a coursework prototype for study-abroad advisers. It helps a human choose and draft a next response; it does not send messages or establish sales conversion. The public browser demonstration uses a fixed synthetic script. Optional model providers exist, but live model quality and real customer outcomes have not been validated. The six-step Gold-assisted flow in the presentation is a design extension; the public runtime's nominal path has tool planning, Decision, and Conversation calls. See the </w:t>
-      </w:r>
-      <w:hyperlink r:id="rId9">
-        <w:r>
-          <w:rPr>
-            <w:color w:val="255C90"/>
-            <w:u w:val="single"/>
-          </w:rPr>
-          <w:t>architecture</w:t>
-        </w:r>
-      </w:hyperlink>
-      <w:r>
-        <w:t xml:space="preserve"> and </w:t>
-      </w:r>
-      <w:hyperlink r:id="rId10">
-        <w:r>
-          <w:rPr>
-            <w:color w:val="255C90"/>
-            <w:u w:val="single"/>
-          </w:rPr>
-          <w:t>browser guide</w:t>
-        </w:r>
-      </w:hyperlink>
-      <w:r>
-        <w:t>.</w:t>
+        <w:t>I started this project with a simple question: could an LLM help a study abroad adviser decide what to do next, rather than just write a nicer message? A student may ask about price, timing, or an application task, and the adviser has to work out what is still unclear before replying. V2 is my attempt to make that decision visible. This report looks at what that design might be worth and what it costs. The public browser demo uses fictional data and a fixed script, so it is a demonstration of the workflow, not proof of better sales results.</w:t>
       </w:r>
     </w:p>
     <w:p>
@@ -51,58 +20,30 @@
         <w:pStyle w:val="Heading1"/>
       </w:pPr>
       <w:r>
-        <w:t>The business choice</w:t>
+        <w:t>Why I used two agents</w:t>
       </w:r>
     </w:p>
     <w:p>
-      <w:pPr/>
       <w:r>
-        <w:t xml:space="preserve">The product's potential value is to reduce the time an adviser spends interpreting an ambiguous student message while making the proposed next action inspectable. A fluent sales message has little value if it ignores the student's actual obstacle, invents a programme fact, promises an unapproved discount, or contacts someone who has withdrawn permission. V2 therefore separates </w:t>
-      </w:r>
-      <w:r>
-        <w:rPr>
-          <w:b/>
-        </w:rPr>
-        <w:t>what to do</w:t>
-      </w:r>
-      <w:r>
-        <w:t xml:space="preserve"> (Decision Agent) from </w:t>
-      </w:r>
-      <w:r>
-        <w:rPr>
-          <w:b/>
-        </w:rPr>
-        <w:t>how to say it</w:t>
-      </w:r>
-      <w:r>
-        <w:t xml:space="preserve"> (Conversation Agent), then applies policy checks and human review. This creates accountability but adds process and cost.</w:t>
+        <w:t>The Decision Agent chooses a short-term goal and a next action. The Conversation Agent then turns that plan into a message the student could read. For example, if the student has not said which part of an application they need help with, the decision can be to clarify that need first. The reply should ask the question plainly, without adding a price or a promise that nobody approved.</w:t>
       </w:r>
     </w:p>
     <w:p>
-      <w:pPr/>
       <w:r>
-        <w:t xml:space="preserve">The </w:t>
+        <w:t>Splitting the work helps me see whether a poor reply came from the choice of action or from its wording. It also makes the system slower and more complicated than a single model call. A decision can fail validation, and a revision can require another call. That extra work only makes sense if the separation helps advisers make better decisions or catch more mistakes.</w:t>
       </w:r>
-      <w:hyperlink r:id="rId11">
-        <w:r>
-          <w:rPr>
-            <w:color w:val="255C90"/>
-            <w:u w:val="single"/>
-          </w:rPr>
-          <w:t>cost model</w:t>
-        </w:r>
-      </w:hyperlink>
+    </w:p>
+    <w:p>
+      <w:pPr>
+        <w:pStyle w:val="Heading1"/>
+      </w:pPr>
       <w:r>
-        <w:t xml:space="preserve"> compares three </w:t>
+        <w:t>Cost comparison</w:t>
       </w:r>
+    </w:p>
+    <w:p>
       <w:r>
-        <w:rPr>
-          <w:i/>
-        </w:rPr>
-        <w:t>analytical scenarios</w:t>
-      </w:r>
-      <w:r>
-        <w:t>, not three proven products:</w:t>
+        <w:t>I compared three possible designs using the assumed inputs in analysis/COST_ANALYSIS.md. The table uses 200 enquiries per month and a loaded labour cost of $20 per hour. These are coursework assumptions, not bills or measured adviser time.</w:t>
       </w:r>
     </w:p>
     <w:tbl>
@@ -114,68 +55,74 @@
         <w:tblLook w:firstColumn="1" w:firstRow="1" w:lastColumn="0" w:lastRow="0" w:noHBand="0" w:noVBand="1" w:val="04A0"/>
       </w:tblPr>
       <w:tblGrid>
-        <w:gridCol w:w="3293"/>
-        <w:gridCol w:w="3293"/>
-        <w:gridCol w:w="3293"/>
+        <w:gridCol w:w="3216"/>
+        <w:gridCol w:w="3216"/>
+        <w:gridCol w:w="3216"/>
       </w:tblGrid>
       <w:tr>
         <w:trPr>
+          <w:tblHeader/>
+          <w:tblHeader/>
+          <w:tblHeader/>
           <w:cantSplit/>
         </w:trPr>
         <w:tc>
           <w:tcPr>
-            <w:tcW w:type="dxa" w:w="2059"/>
+            <w:tcW w:type="dxa" w:w="2088"/>
             <w:vAlign w:val="center"/>
-            <w:shd w:fill="EAF0F4"/>
           </w:tcPr>
           <w:p>
             <w:pPr>
-              <w:spacing w:after="40" w:before="40"/>
+              <w:spacing w:after="60" w:before="60" w:line="259" w:lineRule="auto"/>
             </w:pPr>
             <w:r>
               <w:rPr>
+                <w:rFonts w:ascii="Times New Roman" w:hAnsi="Times New Roman"/>
                 <w:b/>
-                <w:sz w:val="18"/>
+                <w:color w:val="000000"/>
+                <w:sz w:val="19"/>
               </w:rPr>
-              <w:t>Option</w:t>
+              <w:t>Approach</w:t>
             </w:r>
           </w:p>
         </w:tc>
         <w:tc>
           <w:tcPr>
-            <w:tcW w:type="dxa" w:w="3672"/>
+            <w:tcW w:type="dxa" w:w="2160"/>
             <w:vAlign w:val="center"/>
-            <w:shd w:fill="EAF0F4"/>
           </w:tcPr>
           <w:p>
             <w:pPr>
-              <w:spacing w:after="40" w:before="40"/>
+              <w:spacing w:after="60" w:before="60" w:line="259" w:lineRule="auto"/>
             </w:pPr>
             <w:r>
               <w:rPr>
+                <w:rFonts w:ascii="Times New Roman" w:hAnsi="Times New Roman"/>
                 <w:b/>
-                <w:sz w:val="18"/>
+                <w:color w:val="000000"/>
+                <w:sz w:val="19"/>
               </w:rPr>
-              <w:t>Business advantage</w:t>
+              <w:t>Estimated cost per month</w:t>
             </w:r>
           </w:p>
         </w:tc>
         <w:tc>
           <w:tcPr>
-            <w:tcW w:type="dxa" w:w="3686"/>
+            <w:tcW w:type="dxa" w:w="5832"/>
             <w:vAlign w:val="center"/>
-            <w:shd w:fill="EAF0F4"/>
           </w:tcPr>
           <w:p>
             <w:pPr>
-              <w:spacing w:after="40" w:before="40"/>
+              <w:spacing w:after="60" w:before="60" w:line="259" w:lineRule="auto"/>
             </w:pPr>
             <w:r>
               <w:rPr>
+                <w:rFonts w:ascii="Times New Roman" w:hAnsi="Times New Roman"/>
                 <w:b/>
-                <w:sz w:val="18"/>
+                <w:color w:val="000000"/>
+                <w:sz w:val="19"/>
               </w:rPr>
-              <w:t>Main cost or risk</w:t>
+              <w:t>What I gain or give up</w:t>
             </w:r>
           </w:p>
         </w:tc>
@@ -186,53 +133,61 @@
         </w:trPr>
         <w:tc>
           <w:tcPr>
-            <w:tcW w:type="dxa" w:w="2059"/>
+            <w:tcW w:type="dxa" w:w="2088"/>
             <w:vAlign w:val="center"/>
           </w:tcPr>
           <w:p>
             <w:pPr>
-              <w:spacing w:after="40" w:before="40"/>
+              <w:spacing w:after="60" w:before="60" w:line="259" w:lineRule="auto"/>
             </w:pPr>
             <w:r>
               <w:rPr>
-                <w:b/>
-                <w:sz w:val="18"/>
+                <w:rFonts w:ascii="Times New Roman" w:hAnsi="Times New Roman"/>
+                <w:b w:val="0"/>
+                <w:color w:val="000000"/>
+                <w:sz w:val="19"/>
               </w:rPr>
-              <w:t>B0: rules and templates</w:t>
+              <w:t>B0  Rules and templates</w:t>
             </w:r>
           </w:p>
         </w:tc>
         <w:tc>
           <w:tcPr>
-            <w:tcW w:type="dxa" w:w="3672"/>
+            <w:tcW w:type="dxa" w:w="2160"/>
             <w:vAlign w:val="center"/>
           </w:tcPr>
           <w:p>
             <w:pPr>
-              <w:spacing w:after="40" w:before="40"/>
+              <w:spacing w:after="60" w:before="60" w:line="259" w:lineRule="auto"/>
             </w:pPr>
             <w:r>
               <w:rPr>
-                <w:sz w:val="18"/>
+                <w:rFonts w:ascii="Times New Roman" w:hAnsi="Times New Roman"/>
+                <w:b w:val="0"/>
+                <w:color w:val="000000"/>
+                <w:sz w:val="19"/>
               </w:rPr>
-              <w:t>No model charge; simple to operate.</w:t>
+              <w:t>$600.00</w:t>
             </w:r>
           </w:p>
         </w:tc>
         <w:tc>
           <w:tcPr>
-            <w:tcW w:type="dxa" w:w="3686"/>
+            <w:tcW w:type="dxa" w:w="5832"/>
             <w:vAlign w:val="center"/>
           </w:tcPr>
           <w:p>
             <w:pPr>
-              <w:spacing w:after="40" w:before="40"/>
+              <w:spacing w:after="60" w:before="60" w:line="259" w:lineRule="auto"/>
             </w:pPr>
             <w:r>
               <w:rPr>
-                <w:sz w:val="18"/>
+                <w:rFonts w:ascii="Times New Roman" w:hAnsi="Times New Roman"/>
+                <w:b w:val="0"/>
+                <w:color w:val="000000"/>
+                <w:sz w:val="19"/>
               </w:rPr>
-              <w:t>Rigid responses can miss combined or unusual student concerns.</w:t>
+              <w:t>No model charge, but limited flexibility for unusual questions.</w:t>
             </w:r>
           </w:p>
         </w:tc>
@@ -243,53 +198,61 @@
         </w:trPr>
         <w:tc>
           <w:tcPr>
-            <w:tcW w:type="dxa" w:w="2059"/>
+            <w:tcW w:type="dxa" w:w="2088"/>
             <w:vAlign w:val="center"/>
           </w:tcPr>
           <w:p>
             <w:pPr>
-              <w:spacing w:after="40" w:before="40"/>
+              <w:spacing w:after="60" w:before="60" w:line="259" w:lineRule="auto"/>
             </w:pPr>
             <w:r>
               <w:rPr>
-                <w:b/>
-                <w:sz w:val="18"/>
+                <w:rFonts w:ascii="Times New Roman" w:hAnsi="Times New Roman"/>
+                <w:b w:val="0"/>
+                <w:color w:val="000000"/>
+                <w:sz w:val="19"/>
               </w:rPr>
-              <w:t>B1: one model call</w:t>
+              <w:t>B1  One model call</w:t>
             </w:r>
           </w:p>
         </w:tc>
         <w:tc>
           <w:tcPr>
-            <w:tcW w:type="dxa" w:w="3672"/>
+            <w:tcW w:type="dxa" w:w="2160"/>
             <w:vAlign w:val="center"/>
           </w:tcPr>
           <w:p>
             <w:pPr>
-              <w:spacing w:after="40" w:before="40"/>
+              <w:spacing w:after="60" w:before="60" w:line="259" w:lineRule="auto"/>
             </w:pPr>
             <w:r>
               <w:rPr>
-                <w:sz w:val="18"/>
+                <w:rFonts w:ascii="Times New Roman" w:hAnsi="Times New Roman"/>
+                <w:b w:val="0"/>
+                <w:color w:val="000000"/>
+                <w:sz w:val="19"/>
               </w:rPr>
-              <w:t>Lower build and operating burden than V2.</w:t>
+              <w:t>$542.26</w:t>
             </w:r>
           </w:p>
         </w:tc>
         <w:tc>
           <w:tcPr>
-            <w:tcW w:type="dxa" w:w="3686"/>
+            <w:tcW w:type="dxa" w:w="5832"/>
             <w:vAlign w:val="center"/>
           </w:tcPr>
           <w:p>
             <w:pPr>
-              <w:spacing w:after="40" w:before="40"/>
+              <w:spacing w:after="60" w:before="60" w:line="259" w:lineRule="auto"/>
             </w:pPr>
             <w:r>
               <w:rPr>
-                <w:sz w:val="18"/>
+                <w:rFonts w:ascii="Times New Roman" w:hAnsi="Times New Roman"/>
+                <w:b w:val="0"/>
+                <w:color w:val="000000"/>
+                <w:sz w:val="19"/>
               </w:rPr>
-              <w:t>Decision, evidence use, and wording are harder to inspect separately.</w:t>
+              <w:t>Simpler and cheaper here, but the decision and wording are harder to inspect separately.</w:t>
             </w:r>
           </w:p>
         </w:tc>
@@ -300,53 +263,61 @@
         </w:trPr>
         <w:tc>
           <w:tcPr>
-            <w:tcW w:type="dxa" w:w="2059"/>
+            <w:tcW w:type="dxa" w:w="2088"/>
             <w:vAlign w:val="center"/>
           </w:tcPr>
           <w:p>
             <w:pPr>
-              <w:spacing w:after="40" w:before="40"/>
+              <w:spacing w:after="60" w:before="60" w:line="259" w:lineRule="auto"/>
             </w:pPr>
             <w:r>
               <w:rPr>
-                <w:b/>
-                <w:sz w:val="18"/>
+                <w:rFonts w:ascii="Times New Roman" w:hAnsi="Times New Roman"/>
+                <w:b w:val="0"/>
+                <w:color w:val="000000"/>
+                <w:sz w:val="19"/>
               </w:rPr>
-              <w:t>B2: staged V2</w:t>
+              <w:t>B2  Staged V2</w:t>
             </w:r>
           </w:p>
         </w:tc>
         <w:tc>
           <w:tcPr>
-            <w:tcW w:type="dxa" w:w="3672"/>
+            <w:tcW w:type="dxa" w:w="2160"/>
             <w:vAlign w:val="center"/>
           </w:tcPr>
           <w:p>
             <w:pPr>
-              <w:spacing w:after="40" w:before="40"/>
+              <w:spacing w:after="60" w:before="60" w:line="259" w:lineRule="auto"/>
             </w:pPr>
             <w:r>
               <w:rPr>
-                <w:sz w:val="18"/>
+                <w:rFonts w:ascii="Times New Roman" w:hAnsi="Times New Roman"/>
+                <w:b w:val="0"/>
+                <w:color w:val="000000"/>
+                <w:sz w:val="19"/>
               </w:rPr>
-              <w:t>Explicit objective, evidence lineage, bounded wording, and review.</w:t>
+              <w:t>$594.20</w:t>
             </w:r>
           </w:p>
         </w:tc>
         <w:tc>
           <w:tcPr>
-            <w:tcW w:type="dxa" w:w="3686"/>
+            <w:tcW w:type="dxa" w:w="5832"/>
             <w:vAlign w:val="center"/>
           </w:tcPr>
           <w:p>
             <w:pPr>
-              <w:spacing w:after="40" w:before="40"/>
+              <w:spacing w:after="60" w:before="60" w:line="259" w:lineRule="auto"/>
             </w:pPr>
             <w:r>
               <w:rPr>
-                <w:sz w:val="18"/>
+                <w:rFonts w:ascii="Times New Roman" w:hAnsi="Times New Roman"/>
+                <w:b w:val="0"/>
+                <w:color w:val="000000"/>
+                <w:sz w:val="19"/>
               </w:rPr>
-              <w:t>More calls, latency, maintenance, and possible handoffs.</w:t>
+              <w:t>Clearer decision and review trail, with more calls and maintenance.</w:t>
             </w:r>
           </w:p>
         </w:tc>
@@ -358,138 +329,8 @@
       </w:pPr>
     </w:p>
     <w:p>
-      <w:pPr/>
       <w:r>
-        <w:t xml:space="preserve">All dollar and time figures are </w:t>
-      </w:r>
-      <w:r>
-        <w:rPr>
-          <w:b/>
-        </w:rPr>
-        <w:t>author-defined assumptions</w:t>
-      </w:r>
-      <w:r>
-        <w:t xml:space="preserve">, not invoices or adviser measurements. At 200 enquiries per month and a loaded labour rate of $20/hour, the model estimates monthly totals of </w:t>
-      </w:r>
-      <w:r>
-        <w:rPr>
-          <w:b/>
-        </w:rPr>
-        <w:t>$600 for B0, $542.26 for B1, and $594.20 for B2</w:t>
-      </w:r>
-      <w:r>
-        <w:t xml:space="preserve">. B2 assumes 393 human seconds per enquiry versus 427.8 for B1, yet costs </w:t>
-      </w:r>
-      <w:r>
-        <w:rPr>
-          <w:b/>
-        </w:rPr>
-        <w:t>$51.94 more per month</w:t>
-      </w:r>
-      <w:r>
-        <w:t xml:space="preserve"> at this volume because of higher fixed and amortized build costs. Under unchanged assumptions, B2 breaks even with B1 at roughly </w:t>
-      </w:r>
-      <w:r>
-        <w:rPr>
-          <w:b/>
-        </w:rPr>
-        <w:t>473 enquiries per month</w:t>
-      </w:r>
-      <w:r>
-        <w:t>. At 50 enquiries and $10/hour, B2 is much more expensive; at 1,000 and $40/hour, its assumed labour saving outweighs its overhead. The model therefore does not justify “more agents” by itself. It asks whether real review time, error reduction, and acceptable actions compensate for the added stages. The nominal B2 estimate prices three model calls, not extra Gold-selection calls, human-requested revisions, or a possible Decision repair.</w:t>
-      </w:r>
-    </w:p>
-    <w:p>
-      <w:pPr>
-        <w:pStyle w:val="Heading1"/>
-        <w:pageBreakBefore/>
-      </w:pPr>
-      <w:r>
-        <w:t>Technical tradeoffs</w:t>
-      </w:r>
-    </w:p>
-    <w:p>
-      <w:pPr/>
-      <w:r>
-        <w:rPr>
-          <w:b/>
-        </w:rPr>
-        <w:t>Separation versus latency.</w:t>
-      </w:r>
-      <w:r>
-        <w:t xml:space="preserve"> The Decision Agent writes an objective, next action, evidence IDs, and a content contract. The Conversation Agent turns that contract into a draft without changing material commitments. This division makes a bad strategy easier to distinguish from bad wording, but each provider call can add delay or fail. A bounded repair can add another Decision call. The default offline walkthrough proves the </w:t>
-      </w:r>
-      <w:hyperlink r:id="rId12">
-        <w:r>
-          <w:rPr>
-            <w:color w:val="255C90"/>
-            <w:u w:val="single"/>
-          </w:rPr>
-          <w:t>event and Gate wiring</w:t>
-        </w:r>
-      </w:hyperlink>
-      <w:r>
-        <w:t>, not live inference speed or judgment quality.</w:t>
-      </w:r>
-    </w:p>
-    <w:p>
-      <w:pPr/>
-      <w:r>
-        <w:rPr>
-          <w:b/>
-        </w:rPr>
-        <w:t>Retrieval versus source governance.</w:t>
-      </w:r>
-      <w:r>
-        <w:t xml:space="preserve"> Four read-only tool interfaces cover sales methods, approved advantages, anonymized cases, and programme facts. Retrieval can help answer a specific question, but an unavailable, stale, or unapproved result must not become a customer claim. The public bridge has no approved live Cases or programme source by default, so the recorded browser walkthrough makes zero tool calls. Supplying reliable sources would add approval, freshness checks, provenance work, and possible licensing cost. The </w:t>
-      </w:r>
-      <w:hyperlink r:id="rId13">
-        <w:r>
-          <w:rPr>
-            <w:color w:val="255C90"/>
-            <w:u w:val="single"/>
-          </w:rPr>
-          <w:t>tool and bridge code</w:t>
-        </w:r>
-      </w:hyperlink>
-      <w:r>
-        <w:t xml:space="preserve"> documents these boundaries.</w:t>
-      </w:r>
-    </w:p>
-    <w:p>
-      <w:pPr/>
-      <w:r>
-        <w:rPr>
-          <w:b/>
-        </w:rPr>
-        <w:t>Context versus privacy and omission.</w:t>
-      </w:r>
-      <w:r>
-        <w:t xml:space="preserve"> V2 projects recent customer-visible messages, selected source-linked older quotes, verified profile fields, and working memory. It keeps student statements distinct from agent hypotheses and unsent drafts. A bounded context reduces token use and accidental disclosure, but a relevant older detail can be omitted or misunderstood; the source record must remain available for review. The </w:t>
-      </w:r>
-      <w:hyperlink r:id="rId14">
-        <w:r>
-          <w:rPr>
-            <w:color w:val="255C90"/>
-            <w:u w:val="single"/>
-          </w:rPr>
-          <w:t>context projection</w:t>
-        </w:r>
-      </w:hyperlink>
-      <w:r>
-        <w:t xml:space="preserve"> is a design control, not proof that every decision has enough context.</w:t>
-      </w:r>
-    </w:p>
-    <w:p>
-      <w:pPr/>
-      <w:r>
-        <w:rPr>
-          <w:b/>
-        </w:rPr>
-        <w:t>Controls versus friction.</w:t>
-      </w:r>
-      <w:r>
-        <w:t xml:space="preserve"> Deterministic Gates, offer approval, contact permission, and separate actual-send records reduce the chance of unauthorized commitments. They also require human time and can stop a potentially useful response. This is appropriate for the current assistant role: the model proposes; an adviser decides what, if anything, to send. Real deployment would additionally need authentication, protected storage, approved data sources, and operational monitoring.</w:t>
+        <w:t>In this example V2 costs $51.94 more per month than the one-call option. It assumes 393 seconds of human work per enquiry, compared with 427.8 seconds for one call, but that saving is not enough to cover V2’s larger fixed and build costs at this volume. With the same assumptions, V2 reaches the one-call cost at about 473 enquiries per month. The estimate counts three model calls for V2’s normal path. It does not cover extra revisions, failed calls, or any future Gold-selection steps. I would not claim that V2 saves money until those costs and the adviser’s time have been measured.</w:t>
       </w:r>
     </w:p>
     <w:p>
@@ -497,45 +338,53 @@
         <w:pStyle w:val="Heading1"/>
       </w:pPr>
       <w:r>
-        <w:t>Evidence and recommendation</w:t>
+        <w:t>Evidence and control</w:t>
       </w:r>
     </w:p>
     <w:p>
-      <w:pPr/>
       <w:r>
-        <w:t xml:space="preserve">The public </w:t>
-      </w:r>
-      <w:hyperlink r:id="rId15">
-        <w:r>
-          <w:rPr>
-            <w:color w:val="255C90"/>
-            <w:u w:val="single"/>
-          </w:rPr>
-          <w:t>evaluation package</w:t>
-        </w:r>
-      </w:hyperlink>
-      <w:r>
-        <w:t xml:space="preserve"> has 24 English synthetic cases: 16 development scenarios and 8 invented challenges. Its executed scripted first-turn probe created 22 unsent drafts, with one unknown-permission handoff and one do-not-contact block. Four cases lack equivalent runtime evidence fixtures; among the remaining 18, the canned action label matches 5. No case has independent human semantic review, and the two-case local model diagnostic produced two provider handoffs before a decision. These results test wiring and reveal gaps; they cannot establish model quality or revenue impact.</w:t>
+        <w:t>V2 has four read-only tool interfaces for sales methods, approved advantages, anonymised cases, and programme information. The useful part of retrieval is that a decision can point to a source. The difficult part is keeping sources approved and current. In the public demo there is no approved live Cases or programme database, and the scripted walkthrough makes no tool calls. Connecting those sources properly would add work for checking facts, versions, and permissions.</w:t>
       </w:r>
     </w:p>
     <w:p>
-      <w:pPr/>
       <w:r>
-        <w:t xml:space="preserve">I would keep V2 as a </w:t>
+        <w:t>The agent also receives a limited view of the student record: recent student-visible messages, verified profile fields, some older quotes with source links, and working memory. This keeps the prompt smaller and avoids treating an unsent draft or an agent guess as something the student said. The risk is that a relevant older detail may be left out. An adviser still needs access to the original record when checking a draft.</w:t>
       </w:r>
+    </w:p>
+    <w:p>
       <w:r>
-        <w:rPr>
-          <w:b/>
-        </w:rPr>
-        <w:t>human-reviewed prototype</w:t>
+        <w:t>Before any message can be sent, the system checks contact permission, prices, claims, and approvals. A human must review the draft, and the browser does not send it to the student. This creates an extra step, but I think it is justified while the system is experimental. It would be worse to move quickly and make an unsupported offer or contact someone who asked us to stop.</w:t>
       </w:r>
+    </w:p>
+    <w:p>
+      <w:pPr>
+        <w:pStyle w:val="Heading1"/>
+      </w:pPr>
       <w:r>
-        <w:t>. Next, compare B1 and B2 on a fresh sealed case set with the same inputs and budget. Have independent advisers score action usefulness, evidence support, forbidden claims, and editing time; log attempted-call tokens, failures, p50/p95 latency, and review minutes. Replace the assumed cost inputs with invoices and observed work. Expand the staged design only if it improves reviewer-accepted actions and safety enough to justify its measured cost and delay. Any claim about conversion requires later, consented real-workflow evidence rather than synthetic Gold or a polished video.</w:t>
+        <w:t>What the tests tell me</w:t>
+      </w:r>
+    </w:p>
+    <w:p>
+      <w:r>
+        <w:t>The public evaluation set has 24 English fictional cases: 16 development cases and eight new challenge cases. A fixed-script first-turn run produced 22 unsent drafts; one case stopped because contact permission was unknown and one because the student had requested no further contact. Four cases lacked matching evidence inputs in the runtime. Of the remaining 18, the canned next-action label matched the reference label in five cases. No case has been independently judged by an adviser for the quality of its wording or decision. The separate two-case local model check ended in handoffs before a decision. These results show that parts of the workflow and safety checks run, but they do not show that the model is a good salesperson. The details are in evals/README.md.</w:t>
+      </w:r>
+    </w:p>
+    <w:p>
+      <w:pPr>
+        <w:pStyle w:val="Heading1"/>
+      </w:pPr>
+      <w:r>
+        <w:t>My conclusion</w:t>
+      </w:r>
+    </w:p>
+    <w:p>
+      <w:r>
+        <w:t>I would keep V2 as a human-reviewed project for now. The next useful test is to give the same new cases to the one-call design and V2, then ask advisers who do not know which system produced each answer to judge the next action, factual support, and time needed to edit it. I would also record actual API usage, failed calls, and waiting time. Only then could I decide whether the second agent earns its extra cost. A claim about sales conversion would need later evidence from a real, consented workflow; the current scripted demo and fictional Gold answers cannot establish it.</w:t>
       </w:r>
     </w:p>
     <w:sectPr>
       <w:pgSz w:w="12240" w:h="15840"/>
-      <w:pgMar w:top="1123" w:right="1181" w:bottom="1051" w:left="1181" w:header="720" w:footer="720" w:gutter="0"/>
+      <w:pgMar w:top="1181" w:right="1296" w:bottom="1181" w:left="1296" w:header="720" w:footer="720" w:gutter="0"/>
       <w:cols w:space="720"/>
       <w:docGrid w:linePitch="360"/>
     </w:sectPr>
@@ -907,12 +756,12 @@
     <w:qFormat/>
     <w:rsid w:val="00FC693F"/>
     <w:pPr>
-      <w:spacing w:after="120" w:line="274" w:lineRule="auto"/>
+      <w:spacing w:after="140" w:line="278" w:lineRule="auto"/>
     </w:pPr>
     <w:rPr>
-      <w:rFonts w:ascii="Aptos" w:hAnsi="Aptos"/>
-      <w:color w:val="232A32"/>
-      <w:sz w:val="21"/>
+      <w:rFonts w:ascii="Times New Roman" w:hAnsi="Times New Roman"/>
+      <w:color w:val="000000"/>
+      <w:sz w:val="22"/>
     </w:rPr>
   </w:style>
   <w:style w:type="paragraph" w:styleId="Header">
@@ -970,15 +819,15 @@
     <w:pPr>
       <w:keepNext/>
       <w:keepLines/>
-      <w:spacing w:before="300" w:after="120"/>
+      <w:spacing w:before="200" w:after="100"/>
       <w:outlineLvl w:val="0"/>
     </w:pPr>
     <w:rPr>
-      <w:rFonts w:asciiTheme="majorHAnsi" w:eastAsiaTheme="majorEastAsia" w:hAnsiTheme="majorHAnsi" w:cstheme="majorBidi" w:ascii="Aptos Display" w:hAnsi="Aptos Display"/>
+      <w:rFonts w:asciiTheme="majorHAnsi" w:eastAsiaTheme="majorEastAsia" w:hAnsiTheme="majorHAnsi" w:cstheme="majorBidi" w:ascii="Times New Roman" w:hAnsi="Times New Roman"/>
       <w:b/>
       <w:bCs/>
-      <w:color w:val="192739"/>
-      <w:sz w:val="25"/>
+      <w:color w:val="000000"/>
+      <w:sz w:val="22"/>
       <w:szCs w:val="28"/>
     </w:rPr>
   </w:style>
@@ -1257,16 +1106,16 @@
     <w:rsid w:val="00FC693F"/>
     <w:pPr>
       <w:keepNext/>
-      <w:spacing w:after="260" w:line="252" w:lineRule="auto" w:before="0"/>
+      <w:spacing w:after="260" w:line="240" w:lineRule="auto" w:before="0"/>
       <w:contextualSpacing/>
     </w:pPr>
     <w:rPr>
-      <w:rFonts w:asciiTheme="majorHAnsi" w:eastAsiaTheme="majorEastAsia" w:hAnsiTheme="majorHAnsi" w:cstheme="majorBidi" w:ascii="Aptos Display" w:hAnsi="Aptos Display"/>
+      <w:rFonts w:asciiTheme="majorHAnsi" w:eastAsiaTheme="majorEastAsia" w:hAnsiTheme="majorHAnsi" w:cstheme="majorBidi" w:ascii="Times New Roman" w:hAnsi="Times New Roman"/>
       <w:b/>
-      <w:color w:val="192739"/>
+      <w:color w:val="000000"/>
       <w:spacing w:val="5"/>
       <w:kern w:val="28"/>
-      <w:sz w:val="36"/>
+      <w:sz w:val="28"/>
       <w:szCs w:val="52"/>
     </w:rPr>
   </w:style>

</xml_diff>